<commit_message>
feat(memory): ship epistemic recall and eval harness
</commit_message>
<xml_diff>
--- a/Documents/SIFTA_Technical_Brief.docx
+++ b/Documents/SIFTA_Technical_Brief.docx
@@ -68,7 +68,7 @@
         <w:t xml:space="preserve">Purpose of this document. </w:t>
       </w:r>
       <w:r>
-        <w:t xml:space="preserve">This brief is written for an engineer, not a marketer. It states plainly what SIFTA's software does, separates the claims you can verify on a Mac in minutes from the conceptual model behind the design, and tells you exactly how to check each one. If a claim cannot be reproduced with a standard macOS command, it is labeled as a model or an estimate, not a measurement.</w:t>
+        <w:t xml:space="preserve">This brief is written for an engineer, not a marketer. It states what SIFTA's software does, separates claims you can verify on a Mac in minutes from the conceptual model behind the design, and tells you how to check each one. Every claim here is one of three things: OBSERVED (reproducible with a command), HYPOTHESIS (labeled, not yet proven), or REFUSED (an outcome asserted with no measurable mechanism, which the system actively rejects). It never blends them.</w:t>
       </w:r>
     </w:p>
     <w:p>
@@ -94,7 +94,7 @@
         <w:t xml:space="preserve">stigmergy</w:t>
       </w:r>
       <w:r>
-        <w:t xml:space="preserve">) that lets an ant colony organize without a boss. Two things make it unusual as engineering: (a) every meaningful action must first pass a gate that reads the machine's real thermal and power state and can refuse the work, and (b) every gated action emits a SHA-256 receipt over the sensor readings that authorized it, so the action log is tamper-evident. The system is designed so that energy and heat are first-class budget constraints, not afterthoughts.</w:t>
+        <w:t xml:space="preserve">) that lets an ant colony organize without a boss. Two things make it unusual as engineering: (a) every meaningful action first passes a gate that reads the machine's real thermal and power state and can refuse the work, and (b) every gated action emits a SHA-256 receipt over the sensor readings that authorized it, so the action log is tamper-evident. Energy and heat are first-class budget constraints, not afterthoughts.</w:t>
       </w:r>
     </w:p>
     <w:p>
@@ -110,7 +110,7 @@
         <w:spacing w:after="160" w:line="276"/>
       </w:pPr>
       <w:r>
-        <w:t xml:space="preserve">Each row below is backed by code in the repository. The right column is how a reviewer reproduces it independently.</w:t>
+        <w:t xml:space="preserve">Each row is backed by code in the repository. The right column is how a reviewer reproduces it independently.</w:t>
       </w:r>
     </w:p>
     <w:tbl>
@@ -126,14 +126,14 @@
         </w:tblBorders>
       </w:tblPr>
       <w:tblGrid>
-        <w:gridCol w:w="3000"/>
-        <w:gridCol w:w="4060"/>
-        <w:gridCol w:w="2300"/>
+        <w:gridCol w:w="2700"/>
+        <w:gridCol w:w="3960"/>
+        <w:gridCol w:w="2700"/>
       </w:tblGrid>
       <w:tr>
         <w:tc>
           <w:tcPr>
-            <w:tcW w:type="dxa" w:w="3000"/>
+            <w:tcW w:type="dxa" w:w="2700"/>
             <w:tcBorders>
               <w:top w:val="single" w:color="CCCCCC" w:sz="1"/>
               <w:left w:val="single" w:color="CCCCCC" w:sz="1"/>
@@ -162,7 +162,7 @@
         </w:tc>
         <w:tc>
           <w:tcPr>
-            <w:tcW w:type="dxa" w:w="4060"/>
+            <w:tcW w:type="dxa" w:w="3960"/>
             <w:tcBorders>
               <w:top w:val="single" w:color="CCCCCC" w:sz="1"/>
               <w:left w:val="single" w:color="CCCCCC" w:sz="1"/>
@@ -191,7 +191,7 @@
         </w:tc>
         <w:tc>
           <w:tcPr>
-            <w:tcW w:type="dxa" w:w="2300"/>
+            <w:tcW w:type="dxa" w:w="2700"/>
             <w:tcBorders>
               <w:top w:val="single" w:color="CCCCCC" w:sz="1"/>
               <w:left w:val="single" w:color="CCCCCC" w:sz="1"/>
@@ -222,7 +222,7 @@
       <w:tr>
         <w:tc>
           <w:tcPr>
-            <w:tcW w:type="dxa" w:w="3000"/>
+            <w:tcW w:type="dxa" w:w="2700"/>
             <w:tcBorders>
               <w:top w:val="single" w:color="CCCCCC" w:sz="1"/>
               <w:left w:val="single" w:color="CCCCCC" w:sz="1"/>
@@ -250,7 +250,7 @@
         </w:tc>
         <w:tc>
           <w:tcPr>
-            <w:tcW w:type="dxa" w:w="4060"/>
+            <w:tcW w:type="dxa" w:w="3960"/>
             <w:tcBorders>
               <w:top w:val="single" w:color="CCCCCC" w:sz="1"/>
               <w:left w:val="single" w:color="CCCCCC" w:sz="1"/>
@@ -278,29 +278,29 @@
         </w:tc>
         <w:tc>
           <w:tcPr>
-            <w:tcW w:type="dxa" w:w="2300"/>
-            <w:tcBorders>
-              <w:top w:val="single" w:color="CCCCCC" w:sz="1"/>
-              <w:left w:val="single" w:color="CCCCCC" w:sz="1"/>
-              <w:bottom w:val="single" w:color="CCCCCC" w:sz="1"/>
-              <w:right w:val="single" w:color="CCCCCC" w:sz="1"/>
-            </w:tcBorders>
-            <w:tcMar>
-              <w:top w:type="dxa" w:w="80"/>
-              <w:left w:type="dxa" w:w="120"/>
-              <w:bottom w:type="dxa" w:w="80"/>
-              <w:right w:type="dxa" w:w="120"/>
-            </w:tcMar>
-          </w:tcPr>
-          <w:p>
-            <w:r>
-              <w:rPr>
-                <w:b w:val="false"/>
-                <w:bCs w:val="false"/>
-                <w:sz w:val="20"/>
-                <w:szCs w:val="20"/>
-              </w:rPr>
-              <w:t xml:space="preserve">Run pmset -g therm and compare to the gate's recorded thermal_level.</w:t>
+            <w:tcW w:type="dxa" w:w="2700"/>
+            <w:tcBorders>
+              <w:top w:val="single" w:color="CCCCCC" w:sz="1"/>
+              <w:left w:val="single" w:color="CCCCCC" w:sz="1"/>
+              <w:bottom w:val="single" w:color="CCCCCC" w:sz="1"/>
+              <w:right w:val="single" w:color="CCCCCC" w:sz="1"/>
+            </w:tcBorders>
+            <w:tcMar>
+              <w:top w:type="dxa" w:w="80"/>
+              <w:left w:type="dxa" w:w="120"/>
+              <w:bottom w:type="dxa" w:w="80"/>
+              <w:right w:type="dxa" w:w="120"/>
+            </w:tcMar>
+          </w:tcPr>
+          <w:p>
+            <w:r>
+              <w:rPr>
+                <w:b w:val="false"/>
+                <w:bCs w:val="false"/>
+                <w:sz w:val="20"/>
+                <w:szCs w:val="20"/>
+              </w:rPr>
+              <w:t xml:space="preserve">Run pmset -g therm; compare to the gate's recorded thermal_level.</w:t>
             </w:r>
           </w:p>
         </w:tc>
@@ -308,7 +308,7 @@
       <w:tr>
         <w:tc>
           <w:tcPr>
-            <w:tcW w:type="dxa" w:w="3000"/>
+            <w:tcW w:type="dxa" w:w="2700"/>
             <w:tcBorders>
               <w:top w:val="single" w:color="CCCCCC" w:sz="1"/>
               <w:left w:val="single" w:color="CCCCCC" w:sz="1"/>
@@ -336,7 +336,7 @@
         </w:tc>
         <w:tc>
           <w:tcPr>
-            <w:tcW w:type="dxa" w:w="4060"/>
+            <w:tcW w:type="dxa" w:w="3960"/>
             <w:tcBorders>
               <w:top w:val="single" w:color="CCCCCC" w:sz="1"/>
               <w:left w:val="single" w:color="CCCCCC" w:sz="1"/>
@@ -364,7 +364,7 @@
         </w:tc>
         <w:tc>
           <w:tcPr>
-            <w:tcW w:type="dxa" w:w="2300"/>
+            <w:tcW w:type="dxa" w:w="2700"/>
             <w:tcBorders>
               <w:top w:val="single" w:color="CCCCCC" w:sz="1"/>
               <w:left w:val="single" w:color="CCCCCC" w:sz="1"/>
@@ -394,7 +394,7 @@
       <w:tr>
         <w:tc>
           <w:tcPr>
-            <w:tcW w:type="dxa" w:w="3000"/>
+            <w:tcW w:type="dxa" w:w="2700"/>
             <w:tcBorders>
               <w:top w:val="single" w:color="CCCCCC" w:sz="1"/>
               <w:left w:val="single" w:color="CCCCCC" w:sz="1"/>
@@ -422,7 +422,7 @@
         </w:tc>
         <w:tc>
           <w:tcPr>
-            <w:tcW w:type="dxa" w:w="4060"/>
+            <w:tcW w:type="dxa" w:w="3960"/>
             <w:tcBorders>
               <w:top w:val="single" w:color="CCCCCC" w:sz="1"/>
               <w:left w:val="single" w:color="CCCCCC" w:sz="1"/>
@@ -450,29 +450,29 @@
         </w:tc>
         <w:tc>
           <w:tcPr>
-            <w:tcW w:type="dxa" w:w="2300"/>
-            <w:tcBorders>
-              <w:top w:val="single" w:color="CCCCCC" w:sz="1"/>
-              <w:left w:val="single" w:color="CCCCCC" w:sz="1"/>
-              <w:bottom w:val="single" w:color="CCCCCC" w:sz="1"/>
-              <w:right w:val="single" w:color="CCCCCC" w:sz="1"/>
-            </w:tcBorders>
-            <w:tcMar>
-              <w:top w:type="dxa" w:w="80"/>
-              <w:left w:type="dxa" w:w="120"/>
-              <w:bottom w:type="dxa" w:w="80"/>
-              <w:right w:type="dxa" w:w="120"/>
-            </w:tcMar>
-          </w:tcPr>
-          <w:p>
-            <w:r>
-              <w:rPr>
-                <w:b w:val="false"/>
-                <w:bCs w:val="false"/>
-                <w:sz w:val="20"/>
-                <w:szCs w:val="20"/>
-              </w:rPr>
-              <w:t xml:space="preserve">Inspect /api/inference_joule_receipt output: net_low / net_high and measurement_method.</w:t>
+            <w:tcW w:type="dxa" w:w="2700"/>
+            <w:tcBorders>
+              <w:top w:val="single" w:color="CCCCCC" w:sz="1"/>
+              <w:left w:val="single" w:color="CCCCCC" w:sz="1"/>
+              <w:bottom w:val="single" w:color="CCCCCC" w:sz="1"/>
+              <w:right w:val="single" w:color="CCCCCC" w:sz="1"/>
+            </w:tcBorders>
+            <w:tcMar>
+              <w:top w:type="dxa" w:w="80"/>
+              <w:left w:type="dxa" w:w="120"/>
+              <w:bottom w:type="dxa" w:w="80"/>
+              <w:right w:type="dxa" w:w="120"/>
+            </w:tcMar>
+          </w:tcPr>
+          <w:p>
+            <w:r>
+              <w:rPr>
+                <w:b w:val="false"/>
+                <w:bCs w:val="false"/>
+                <w:sz w:val="20"/>
+                <w:szCs w:val="20"/>
+              </w:rPr>
+              <w:t xml:space="preserve">Inspect /api/inference_joule_receipt: net_low / net_high and measurement_method.</w:t>
             </w:r>
           </w:p>
         </w:tc>
@@ -480,85 +480,85 @@
       <w:tr>
         <w:tc>
           <w:tcPr>
-            <w:tcW w:type="dxa" w:w="3000"/>
-            <w:tcBorders>
-              <w:top w:val="single" w:color="CCCCCC" w:sz="1"/>
-              <w:left w:val="single" w:color="CCCCCC" w:sz="1"/>
-              <w:bottom w:val="single" w:color="CCCCCC" w:sz="1"/>
-              <w:right w:val="single" w:color="CCCCCC" w:sz="1"/>
-            </w:tcBorders>
-            <w:tcMar>
-              <w:top w:type="dxa" w:w="80"/>
-              <w:left w:type="dxa" w:w="120"/>
-              <w:bottom w:type="dxa" w:w="80"/>
-              <w:right w:type="dxa" w:w="120"/>
-            </w:tcMar>
-          </w:tcPr>
-          <w:p>
-            <w:r>
-              <w:rPr>
-                <w:b w:val="false"/>
-                <w:bCs w:val="false"/>
-                <w:sz w:val="20"/>
-                <w:szCs w:val="20"/>
-              </w:rPr>
-              <w:t xml:space="preserve">Tamper-evident action log</w:t>
-            </w:r>
-          </w:p>
-        </w:tc>
-        <w:tc>
-          <w:tcPr>
-            <w:tcW w:type="dxa" w:w="4060"/>
-            <w:tcBorders>
-              <w:top w:val="single" w:color="CCCCCC" w:sz="1"/>
-              <w:left w:val="single" w:color="CCCCCC" w:sz="1"/>
-              <w:bottom w:val="single" w:color="CCCCCC" w:sz="1"/>
-              <w:right w:val="single" w:color="CCCCCC" w:sz="1"/>
-            </w:tcBorders>
-            <w:tcMar>
-              <w:top w:type="dxa" w:w="80"/>
-              <w:left w:type="dxa" w:w="120"/>
-              <w:bottom w:type="dxa" w:w="80"/>
-              <w:right w:type="dxa" w:w="120"/>
-            </w:tcMar>
-          </w:tcPr>
-          <w:p>
-            <w:r>
-              <w:rPr>
-                <w:b w:val="false"/>
-                <w:bCs w:val="false"/>
-                <w:sz w:val="20"/>
-                <w:szCs w:val="20"/>
-              </w:rPr>
-              <w:t xml:space="preserve">Every gated action is sealed with a SHA-256 hash over its sensor readings + decision.</w:t>
-            </w:r>
-          </w:p>
-        </w:tc>
-        <w:tc>
-          <w:tcPr>
-            <w:tcW w:type="dxa" w:w="2300"/>
-            <w:tcBorders>
-              <w:top w:val="single" w:color="CCCCCC" w:sz="1"/>
-              <w:left w:val="single" w:color="CCCCCC" w:sz="1"/>
-              <w:bottom w:val="single" w:color="CCCCCC" w:sz="1"/>
-              <w:right w:val="single" w:color="CCCCCC" w:sz="1"/>
-            </w:tcBorders>
-            <w:tcMar>
-              <w:top w:type="dxa" w:w="80"/>
-              <w:left w:type="dxa" w:w="120"/>
-              <w:bottom w:type="dxa" w:w="80"/>
-              <w:right w:type="dxa" w:w="120"/>
-            </w:tcMar>
-          </w:tcPr>
-          <w:p>
-            <w:r>
-              <w:rPr>
-                <w:b w:val="false"/>
-                <w:bCs w:val="false"/>
-                <w:sz w:val="20"/>
-                <w:szCs w:val="20"/>
-              </w:rPr>
-              <w:t xml:space="preserve">Recompute the hash from the logged signals; it must match.</w:t>
+            <w:tcW w:type="dxa" w:w="2700"/>
+            <w:tcBorders>
+              <w:top w:val="single" w:color="CCCCCC" w:sz="1"/>
+              <w:left w:val="single" w:color="CCCCCC" w:sz="1"/>
+              <w:bottom w:val="single" w:color="CCCCCC" w:sz="1"/>
+              <w:right w:val="single" w:color="CCCCCC" w:sz="1"/>
+            </w:tcBorders>
+            <w:tcMar>
+              <w:top w:type="dxa" w:w="80"/>
+              <w:left w:type="dxa" w:w="120"/>
+              <w:bottom w:type="dxa" w:w="80"/>
+              <w:right w:type="dxa" w:w="120"/>
+            </w:tcMar>
+          </w:tcPr>
+          <w:p>
+            <w:r>
+              <w:rPr>
+                <w:b w:val="false"/>
+                <w:bCs w:val="false"/>
+                <w:sz w:val="20"/>
+                <w:szCs w:val="20"/>
+              </w:rPr>
+              <w:t xml:space="preserve">No-double-spend internal credit (STGM)</w:t>
+            </w:r>
+          </w:p>
+        </w:tc>
+        <w:tc>
+          <w:tcPr>
+            <w:tcW w:type="dxa" w:w="3960"/>
+            <w:tcBorders>
+              <w:top w:val="single" w:color="CCCCCC" w:sz="1"/>
+              <w:left w:val="single" w:color="CCCCCC" w:sz="1"/>
+              <w:bottom w:val="single" w:color="CCCCCC" w:sz="1"/>
+              <w:right w:val="single" w:color="CCCCCC" w:sz="1"/>
+            </w:tcBorders>
+            <w:tcMar>
+              <w:top w:type="dxa" w:w="80"/>
+              <w:left w:type="dxa" w:w="120"/>
+              <w:bottom w:type="dxa" w:w="80"/>
+              <w:right w:type="dxa" w:w="120"/>
+            </w:tcMar>
+          </w:tcPr>
+          <w:p>
+            <w:r>
+              <w:rPr>
+                <w:b w:val="false"/>
+                <w:bCs w:val="false"/>
+                <w:sz w:val="20"/>
+                <w:szCs w:val="20"/>
+              </w:rPr>
+              <w:t xml:space="preserve">Each spend carries a SHA-256 attribution key over (organ, trace, ledger, tick); the same event cannot be counted twice. Priced against measured joules.</w:t>
+            </w:r>
+          </w:p>
+        </w:tc>
+        <w:tc>
+          <w:tcPr>
+            <w:tcW w:type="dxa" w:w="2700"/>
+            <w:tcBorders>
+              <w:top w:val="single" w:color="CCCCCC" w:sz="1"/>
+              <w:left w:val="single" w:color="CCCCCC" w:sz="1"/>
+              <w:bottom w:val="single" w:color="CCCCCC" w:sz="1"/>
+              <w:right w:val="single" w:color="CCCCCC" w:sz="1"/>
+            </w:tcBorders>
+            <w:tcMar>
+              <w:top w:type="dxa" w:w="80"/>
+              <w:left w:type="dxa" w:w="120"/>
+              <w:bottom w:type="dxa" w:w="80"/>
+              <w:right w:type="dxa" w:w="120"/>
+            </w:tcMar>
+          </w:tcPr>
+          <w:p>
+            <w:r>
+              <w:rPr>
+                <w:b w:val="false"/>
+                <w:bCs w:val="false"/>
+                <w:sz w:val="20"/>
+                <w:szCs w:val="20"/>
+              </w:rPr>
+              <w:t xml:space="preserve">Read stgm_economy.py make_economic_attribution_key / validate_economic_attribution; replay a row and recompute the key.</w:t>
             </w:r>
           </w:p>
         </w:tc>
@@ -566,7 +566,179 @@
       <w:tr>
         <w:tc>
           <w:tcPr>
-            <w:tcW w:type="dxa" w:w="3000"/>
+            <w:tcW w:type="dxa" w:w="2700"/>
+            <w:tcBorders>
+              <w:top w:val="single" w:color="CCCCCC" w:sz="1"/>
+              <w:left w:val="single" w:color="CCCCCC" w:sz="1"/>
+              <w:bottom w:val="single" w:color="CCCCCC" w:sz="1"/>
+              <w:right w:val="single" w:color="CCCCCC" w:sz="1"/>
+            </w:tcBorders>
+            <w:tcMar>
+              <w:top w:type="dxa" w:w="80"/>
+              <w:left w:type="dxa" w:w="120"/>
+              <w:bottom w:type="dxa" w:w="80"/>
+              <w:right w:type="dxa" w:w="120"/>
+            </w:tcMar>
+          </w:tcPr>
+          <w:p>
+            <w:r>
+              <w:rPr>
+                <w:b w:val="false"/>
+                <w:bCs w:val="false"/>
+                <w:sz w:val="20"/>
+                <w:szCs w:val="20"/>
+              </w:rPr>
+              <w:t xml:space="preserve">Tamper-evident action log</w:t>
+            </w:r>
+          </w:p>
+        </w:tc>
+        <w:tc>
+          <w:tcPr>
+            <w:tcW w:type="dxa" w:w="3960"/>
+            <w:tcBorders>
+              <w:top w:val="single" w:color="CCCCCC" w:sz="1"/>
+              <w:left w:val="single" w:color="CCCCCC" w:sz="1"/>
+              <w:bottom w:val="single" w:color="CCCCCC" w:sz="1"/>
+              <w:right w:val="single" w:color="CCCCCC" w:sz="1"/>
+            </w:tcBorders>
+            <w:tcMar>
+              <w:top w:type="dxa" w:w="80"/>
+              <w:left w:type="dxa" w:w="120"/>
+              <w:bottom w:type="dxa" w:w="80"/>
+              <w:right w:type="dxa" w:w="120"/>
+            </w:tcMar>
+          </w:tcPr>
+          <w:p>
+            <w:r>
+              <w:rPr>
+                <w:b w:val="false"/>
+                <w:bCs w:val="false"/>
+                <w:sz w:val="20"/>
+                <w:szCs w:val="20"/>
+              </w:rPr>
+              <w:t xml:space="preserve">Every gated action is sealed with a SHA-256 hash over its sensor readings + decision.</w:t>
+            </w:r>
+          </w:p>
+        </w:tc>
+        <w:tc>
+          <w:tcPr>
+            <w:tcW w:type="dxa" w:w="2700"/>
+            <w:tcBorders>
+              <w:top w:val="single" w:color="CCCCCC" w:sz="1"/>
+              <w:left w:val="single" w:color="CCCCCC" w:sz="1"/>
+              <w:bottom w:val="single" w:color="CCCCCC" w:sz="1"/>
+              <w:right w:val="single" w:color="CCCCCC" w:sz="1"/>
+            </w:tcBorders>
+            <w:tcMar>
+              <w:top w:type="dxa" w:w="80"/>
+              <w:left w:type="dxa" w:w="120"/>
+              <w:bottom w:type="dxa" w:w="80"/>
+              <w:right w:type="dxa" w:w="120"/>
+            </w:tcMar>
+          </w:tcPr>
+          <w:p>
+            <w:r>
+              <w:rPr>
+                <w:b w:val="false"/>
+                <w:bCs w:val="false"/>
+                <w:sz w:val="20"/>
+                <w:szCs w:val="20"/>
+              </w:rPr>
+              <w:t xml:space="preserve">Recompute the hash from the logged signals; it must match.</w:t>
+            </w:r>
+          </w:p>
+        </w:tc>
+      </w:tr>
+      <w:tr>
+        <w:tc>
+          <w:tcPr>
+            <w:tcW w:type="dxa" w:w="2700"/>
+            <w:tcBorders>
+              <w:top w:val="single" w:color="CCCCCC" w:sz="1"/>
+              <w:left w:val="single" w:color="CCCCCC" w:sz="1"/>
+              <w:bottom w:val="single" w:color="CCCCCC" w:sz="1"/>
+              <w:right w:val="single" w:color="CCCCCC" w:sz="1"/>
+            </w:tcBorders>
+            <w:tcMar>
+              <w:top w:type="dxa" w:w="80"/>
+              <w:left w:type="dxa" w:w="120"/>
+              <w:bottom w:type="dxa" w:w="80"/>
+              <w:right w:type="dxa" w:w="120"/>
+            </w:tcMar>
+          </w:tcPr>
+          <w:p>
+            <w:r>
+              <w:rPr>
+                <w:b w:val="false"/>
+                <w:bCs w:val="false"/>
+                <w:sz w:val="20"/>
+                <w:szCs w:val="20"/>
+              </w:rPr>
+              <w:t xml:space="preserve">Owner-coupled behavior (you-as-data)</w:t>
+            </w:r>
+          </w:p>
+        </w:tc>
+        <w:tc>
+          <w:tcPr>
+            <w:tcW w:type="dxa" w:w="3960"/>
+            <w:tcBorders>
+              <w:top w:val="single" w:color="CCCCCC" w:sz="1"/>
+              <w:left w:val="single" w:color="CCCCCC" w:sz="1"/>
+              <w:bottom w:val="single" w:color="CCCCCC" w:sz="1"/>
+              <w:right w:val="single" w:color="CCCCCC" w:sz="1"/>
+            </w:tcBorders>
+            <w:tcMar>
+              <w:top w:type="dxa" w:w="80"/>
+              <w:left w:type="dxa" w:w="120"/>
+              <w:bottom w:type="dxa" w:w="80"/>
+              <w:right w:type="dxa" w:w="120"/>
+            </w:tcMar>
+          </w:tcPr>
+          <w:p>
+            <w:r>
+              <w:rPr>
+                <w:b w:val="false"/>
+                <w:bCs w:val="false"/>
+                <w:sz w:val="20"/>
+                <w:szCs w:val="20"/>
+              </w:rPr>
+              <w:t xml:space="preserve">The runtime reads real owner-presence telemetry (last-activity, camera/voice) and changes its own rest/consolidation behavior accordingly.</w:t>
+            </w:r>
+          </w:p>
+        </w:tc>
+        <w:tc>
+          <w:tcPr>
+            <w:tcW w:type="dxa" w:w="2700"/>
+            <w:tcBorders>
+              <w:top w:val="single" w:color="CCCCCC" w:sz="1"/>
+              <w:left w:val="single" w:color="CCCCCC" w:sz="1"/>
+              <w:bottom w:val="single" w:color="CCCCCC" w:sz="1"/>
+              <w:right w:val="single" w:color="CCCCCC" w:sz="1"/>
+            </w:tcBorders>
+            <w:tcMar>
+              <w:top w:type="dxa" w:w="80"/>
+              <w:left w:type="dxa" w:w="120"/>
+              <w:bottom w:type="dxa" w:w="80"/>
+              <w:right w:type="dxa" w:w="120"/>
+            </w:tcMar>
+          </w:tcPr>
+          <w:p>
+            <w:r>
+              <w:rPr>
+                <w:b w:val="false"/>
+                <w:bCs w:val="false"/>
+                <w:sz w:val="20"/>
+                <w:szCs w:val="20"/>
+              </w:rPr>
+              <w:t xml:space="preserve">Read swarm_cosleep_field.py vs owner_desktop_presence.json; vary activity, watch the decision change.</w:t>
+            </w:r>
+          </w:p>
+        </w:tc>
+      </w:tr>
+      <w:tr>
+        <w:tc>
+          <w:tcPr>
+            <w:tcW w:type="dxa" w:w="2700"/>
             <w:tcBorders>
               <w:top w:val="single" w:color="CCCCCC" w:sz="1"/>
               <w:left w:val="single" w:color="CCCCCC" w:sz="1"/>
@@ -594,57 +766,57 @@
         </w:tc>
         <w:tc>
           <w:tcPr>
-            <w:tcW w:type="dxa" w:w="4060"/>
-            <w:tcBorders>
-              <w:top w:val="single" w:color="CCCCCC" w:sz="1"/>
-              <w:left w:val="single" w:color="CCCCCC" w:sz="1"/>
-              <w:bottom w:val="single" w:color="CCCCCC" w:sz="1"/>
-              <w:right w:val="single" w:color="CCCCCC" w:sz="1"/>
-            </w:tcBorders>
-            <w:tcMar>
-              <w:top w:type="dxa" w:w="80"/>
-              <w:left w:type="dxa" w:w="120"/>
-              <w:bottom w:type="dxa" w:w="80"/>
-              <w:right w:type="dxa" w:w="120"/>
-            </w:tcMar>
-          </w:tcPr>
-          <w:p>
-            <w:r>
-              <w:rPr>
-                <w:b w:val="false"/>
-                <w:bCs w:val="false"/>
-                <w:sz w:val="20"/>
-                <w:szCs w:val="20"/>
-              </w:rPr>
-              <w:t xml:space="preserve">Independent software agents coordinate via shared traces (stigmergy) rather than a central controller.</w:t>
-            </w:r>
-          </w:p>
-        </w:tc>
-        <w:tc>
-          <w:tcPr>
-            <w:tcW w:type="dxa" w:w="2300"/>
-            <w:tcBorders>
-              <w:top w:val="single" w:color="CCCCCC" w:sz="1"/>
-              <w:left w:val="single" w:color="CCCCCC" w:sz="1"/>
-              <w:bottom w:val="single" w:color="CCCCCC" w:sz="1"/>
-              <w:right w:val="single" w:color="CCCCCC" w:sz="1"/>
-            </w:tcBorders>
-            <w:tcMar>
-              <w:top w:type="dxa" w:w="80"/>
-              <w:left w:type="dxa" w:w="120"/>
-              <w:bottom w:type="dxa" w:w="80"/>
-              <w:right w:type="dxa" w:w="120"/>
-            </w:tcMar>
-          </w:tcPr>
-          <w:p>
-            <w:r>
-              <w:rPr>
-                <w:b w:val="false"/>
-                <w:bCs w:val="false"/>
-                <w:sz w:val="20"/>
-                <w:szCs w:val="20"/>
-              </w:rPr>
-              <w:t xml:space="preserve">Read the trace ledgers; no central scheduler process exists.</w:t>
+            <w:tcW w:type="dxa" w:w="3960"/>
+            <w:tcBorders>
+              <w:top w:val="single" w:color="CCCCCC" w:sz="1"/>
+              <w:left w:val="single" w:color="CCCCCC" w:sz="1"/>
+              <w:bottom w:val="single" w:color="CCCCCC" w:sz="1"/>
+              <w:right w:val="single" w:color="CCCCCC" w:sz="1"/>
+            </w:tcBorders>
+            <w:tcMar>
+              <w:top w:type="dxa" w:w="80"/>
+              <w:left w:type="dxa" w:w="120"/>
+              <w:bottom w:type="dxa" w:w="80"/>
+              <w:right w:type="dxa" w:w="120"/>
+            </w:tcMar>
+          </w:tcPr>
+          <w:p>
+            <w:r>
+              <w:rPr>
+                <w:b w:val="false"/>
+                <w:bCs w:val="false"/>
+                <w:sz w:val="20"/>
+                <w:szCs w:val="20"/>
+              </w:rPr>
+              <w:t xml:space="preserve">Independent software agents coordinate via shared traces (stigmergy), not a central controller.</w:t>
+            </w:r>
+          </w:p>
+        </w:tc>
+        <w:tc>
+          <w:tcPr>
+            <w:tcW w:type="dxa" w:w="2700"/>
+            <w:tcBorders>
+              <w:top w:val="single" w:color="CCCCCC" w:sz="1"/>
+              <w:left w:val="single" w:color="CCCCCC" w:sz="1"/>
+              <w:bottom w:val="single" w:color="CCCCCC" w:sz="1"/>
+              <w:right w:val="single" w:color="CCCCCC" w:sz="1"/>
+            </w:tcBorders>
+            <w:tcMar>
+              <w:top w:type="dxa" w:w="80"/>
+              <w:left w:type="dxa" w:w="120"/>
+              <w:bottom w:type="dxa" w:w="80"/>
+              <w:right w:type="dxa" w:w="120"/>
+            </w:tcMar>
+          </w:tcPr>
+          <w:p>
+            <w:r>
+              <w:rPr>
+                <w:b w:val="false"/>
+                <w:bCs w:val="false"/>
+                <w:sz w:val="20"/>
+                <w:szCs w:val="20"/>
+              </w:rPr>
+              <w:t xml:space="preserve">Read the trace ledgers; there is no central scheduler process.</w:t>
             </w:r>
           </w:p>
         </w:tc>
@@ -696,7 +868,7 @@
         <w:t xml:space="preserve">Estimated energy (heuristic). </w:t>
       </w:r>
       <w:r>
-        <w:t xml:space="preserve">A lightweight cost estimate derived from token counts and CPU load. It is useful for internal budgeting only. It is labeled as an estimate everywhere it appears and is never presented as a measurement.</w:t>
+        <w:t xml:space="preserve">A lightweight cost from token counts and CPU load. Useful for internal budgeting only; labeled as an estimate everywhere it appears and never presented as a measurement.</w:t>
       </w:r>
     </w:p>
     <w:p>
@@ -722,7 +894,7 @@
         <w:t xml:space="preserve">/api/inference_joule_receipt</w:t>
       </w:r>
       <w:r>
-        <w:t xml:space="preserve"> endpoint reads device power before and after an inference, integrates it as watts x time (trapezoidal), subtracts an idle baseline, and attaches an explicit error bound (a low/high range). Critically, if the power source is not a trusted meter, the endpoint </w:t>
+        <w:t xml:space="preserve"> endpoint reads device power before and after an inference, integrates it as watts x time (trapezoidal), subtracts an idle baseline, and attaches an explicit error bound (a low/high range). If the power source is not a trusted meter, the endpoint </w:t>
       </w:r>
       <w:r>
         <w:rPr>
@@ -732,7 +904,7 @@
         <w:t xml:space="preserve">refuses to issue a receipt</w:t>
       </w:r>
       <w:r>
-        <w:t xml:space="preserve"> (HTTP 503) and self-labels its method as </w:t>
+        <w:t xml:space="preserve"> (HTTP 503) and self-labels its method </w:t>
       </w:r>
       <w:r>
         <w:rPr>
@@ -754,7 +926,7 @@
         <w:t xml:space="preserve">powermetrics --samplers smc</w:t>
       </w:r>
       <w:r>
-        <w:t xml:space="preserve">, which requires a one-time privileged install. Where that meter is not active, energy values are reported as estimates, by design.</w:t>
+        <w:t xml:space="preserve"> (a one-time privileged install). Where that meter is inactive, joules are reported as estimates, by design.</w:t>
       </w:r>
     </w:p>
     <w:p>
@@ -780,7 +952,7 @@
         <w:t xml:space="preserve">pmset -g therm</w:t>
       </w:r>
       <w:r>
-        <w:t xml:space="preserve">); joule figures are honest about whether they are metered or estimated, and the system would rather say “I don’t know” than fabricate a measurement.</w:t>
+        <w:t xml:space="preserve">); joule figures are honest about whether they are metered or estimated; the system would rather say “I don't know” than fabricate a measurement.</w:t>
       </w:r>
     </w:p>
     <w:p>
@@ -796,131 +968,15 @@
         <w:pStyle w:val="Heading1"/>
       </w:pPr>
       <w:r>
-        <w:t xml:space="preserve">4. The design philosophy — this is a model, not a physics claim</w:t>
-      </w:r>
-    </w:p>
-    <w:p>
-      <w:pPr>
-        <w:spacing w:after="160" w:line="276"/>
-      </w:pPr>
-      <w:r>
-        <w:t xml:space="preserve">SIFTA is designed using a biological and physical vocabulary: small agents are called “swimmers,” groups of them are “organs,” and the shared trace space is a “field.” This language is a </w:t>
-      </w:r>
-      <w:r>
-        <w:rPr>
-          <w:b/>
-          <w:bCs/>
-        </w:rPr>
-        <w:t xml:space="preserve">design model</w:t>
-      </w:r>
-      <w:r>
-        <w:t xml:space="preserve"> — a way of reasoning about decentralized coordination — and the brief states clearly that it is a model. The software is </w:t>
-      </w:r>
-      <w:r>
-        <w:rPr>
-          <w:b/>
-          <w:bCs/>
-        </w:rPr>
-        <w:t xml:space="preserve">inspired by</w:t>
-      </w:r>
-      <w:r>
-        <w:t xml:space="preserve"> thermodynamics and swarm biology and </w:t>
-      </w:r>
-      <w:r>
-        <w:rPr>
-          <w:b/>
-          <w:bCs/>
-        </w:rPr>
-        <w:t xml:space="preserve">measures and responds to</w:t>
-      </w:r>
-      <w:r>
-        <w:t xml:space="preserve"> real physical quantities; it does not claim to be a new law of physics. Keeping that line sharp is what makes the verifiable claims in Section 2 trustworthy.</w:t>
-      </w:r>
-    </w:p>
-    <w:p>
-      <w:pPr>
-        <w:spacing w:after="160" w:line="276"/>
-      </w:pPr>
-      <w:r>
-        <w:rPr>
-          <w:b/>
-          <w:bCs/>
-        </w:rPr>
-        <w:t xml:space="preserve">Why the model is useful. </w:t>
-      </w:r>
-      <w:r>
-        <w:t xml:space="preserve">Decentralized, trace-based coordination is a well-established idea (stigmergy, swarm intelligence, ant colony optimization). Treating heat and energy as hard constraints that can veto work is a sound engineering response to thermal and battery limits on a single machine. The biological framing makes a large system of cooperating agents easier to reason about, extend, and audit.</w:t>
-      </w:r>
-    </w:p>
-    <w:p>
-      <w:pPr>
-        <w:spacing w:after="160" w:line="276"/>
-      </w:pPr>
-      <w:r>
-        <w:rPr>
-          <w:b/>
-          <w:bCs/>
-        </w:rPr>
-        <w:t xml:space="preserve">Where the model stops. </w:t>
-      </w:r>
-      <w:r>
-        <w:t xml:space="preserve">Phrases like “thermodynamic verification is the cryptographic signature” are design poetry. Mechanically, the thermal reading is one </w:t>
-      </w:r>
-      <w:r>
-        <w:rPr>
-          <w:i/>
-          <w:iCs/>
-        </w:rPr>
-        <w:t xml:space="preserve">input</w:t>
-      </w:r>
-      <w:r>
-        <w:t xml:space="preserve"> to a decision, and the SHA-256 hash is a separate </w:t>
-      </w:r>
-      <w:r>
-        <w:rPr>
-          <w:i/>
-          <w:iCs/>
-        </w:rPr>
-        <w:t xml:space="preserve">seal</w:t>
-      </w:r>
-      <w:r>
-        <w:t xml:space="preserve"> over that decision. They cooperate; they are not literally the same operation. The internal accounting unit (“STGM”) is software bookkeeping, not a physical quantity.</w:t>
-      </w:r>
-    </w:p>
-    <w:p>
-      <w:pPr>
-        <w:pStyle w:val="Heading1"/>
-      </w:pPr>
-      <w:r>
-        <w:t xml:space="preserve">5. What an independent engineer would actually find</w:t>
-      </w:r>
-    </w:p>
-    <w:p>
-      <w:pPr>
-        <w:spacing w:after="160" w:line="276"/>
-      </w:pPr>
-      <w:r>
-        <w:t xml:space="preserve">A competent reviewer reading the code will find a genuine multi-agent runtime: an admission-control gate driven by real OS telemetry, a signed/receipted action ledger, an energy-accounting service with error bounds and an honest refusal path, and a test suite. They will not find new physics, and we do not ask them to. We ask them to verify the engineering claims in Section 2 — all of which are reproducible on a Mac — and to evaluate the architecture on its merits as software.</w:t>
-      </w:r>
-    </w:p>
-    <w:p>
-      <w:pPr>
-        <w:pStyle w:val="Heading1"/>
-      </w:pPr>
-      <w:r>
-        <w:t xml:space="preserve">6. Suggested 30-minute evaluation path</w:t>
-      </w:r>
-    </w:p>
-    <w:p>
-      <w:pPr>
-        <w:spacing w:after="160" w:line="276"/>
-      </w:pPr>
-      <w:r>
-        <w:rPr>
-          <w:b/>
-          <w:bCs/>
-        </w:rPr>
-        <w:t xml:space="preserve">1. </w:t>
+        <w:t xml:space="preserve">4. The coupling test — how SIFTA decides what it may claim</w:t>
+      </w:r>
+    </w:p>
+    <w:p>
+      <w:pPr>
+        <w:spacing w:after="160" w:line="276"/>
+      </w:pPr>
+      <w:r>
+        <w:t xml:space="preserve">The single rule that keeps everything else honest is a coupling test, and it is enforced in code (</w:t>
       </w:r>
       <w:r>
         <w:rPr>
@@ -928,40 +984,211 @@
           <w:sz w:val="20"/>
           <w:szCs w:val="20"/>
         </w:rPr>
-        <w:t xml:space="preserve">pmset -g therm</w:t>
-      </w:r>
-      <w:r>
-        <w:t xml:space="preserve">  — confirm the thermal source the gate reads is real.</w:t>
-      </w:r>
-    </w:p>
-    <w:p>
-      <w:pPr>
-        <w:spacing w:after="160" w:line="276"/>
-      </w:pPr>
-      <w:r>
-        <w:rPr>
-          <w:b/>
-          <w:bCs/>
-        </w:rPr>
-        <w:t xml:space="preserve">2. </w:t>
-      </w:r>
-      <w:r>
-        <w:t xml:space="preserve">Trigger a heavy task while the machine is warm; confirm the gate defers it and logs a denial row.</w:t>
-      </w:r>
-    </w:p>
-    <w:p>
-      <w:pPr>
-        <w:spacing w:after="160" w:line="276"/>
-      </w:pPr>
-      <w:r>
-        <w:rPr>
-          <w:b/>
-          <w:bCs/>
-        </w:rPr>
-        <w:t xml:space="preserve">3. </w:t>
-      </w:r>
-      <w:r>
-        <w:t xml:space="preserve">Call the inference endpoint; inspect the receipt's </w:t>
+        <w:t xml:space="preserve">swarm_observer_observed_boundary.py</w:t>
+      </w:r>
+      <w:r>
+        <w:t xml:space="preserve">). A statement stands as </w:t>
+      </w:r>
+      <w:r>
+        <w:rPr>
+          <w:b/>
+          <w:bCs/>
+        </w:rPr>
+        <w:t xml:space="preserve">operational truth</w:t>
+      </w:r>
+      <w:r>
+        <w:t xml:space="preserve"> only when it is tied to a measurable coupling — a quantity in the ledgers you can read and recompute. A statement that asserts an outcome with no measurable coupling (for example, that belief or observation produces money) is </w:t>
+      </w:r>
+      <w:r>
+        <w:rPr>
+          <w:b/>
+          <w:bCs/>
+        </w:rPr>
+        <w:t xml:space="preserve">refused</w:t>
+      </w:r>
+      <w:r>
+        <w:t xml:space="preserve"> and rewritten in the immune/excretion path. A structural analogy or research direction is allowed but carries an explicit </w:t>
+      </w:r>
+      <w:r>
+        <w:rPr>
+          <w:b/>
+          <w:bCs/>
+        </w:rPr>
+        <w:t xml:space="preserve">HYPOTHESIS</w:t>
+      </w:r>
+      <w:r>
+        <w:t xml:space="preserve"> label. This is the same discipline as the energy section: measure what you can, label what you can't, never blend them.</w:t>
+      </w:r>
+    </w:p>
+    <w:p>
+      <w:pPr>
+        <w:pStyle w:val="Heading1"/>
+      </w:pPr>
+      <w:r>
+        <w:t xml:space="preserve">5. The design model, and where it is genuinely physics</w:t>
+      </w:r>
+    </w:p>
+    <w:p>
+      <w:pPr>
+        <w:spacing w:after="160" w:line="276"/>
+      </w:pPr>
+      <w:r>
+        <w:t xml:space="preserve">SIFTA is designed with a biological/physical vocabulary: agents are “swimmers,” groups are “organs,” the shared trace space is a “field.” That vocabulary is a </w:t>
+      </w:r>
+      <w:r>
+        <w:rPr>
+          <w:b/>
+          <w:bCs/>
+        </w:rPr>
+        <w:t xml:space="preserve">design model</w:t>
+      </w:r>
+      <w:r>
+        <w:t xml:space="preserve"> — but part of it is more than analogy. A stigmergic field (agents depositing a trace that other agents read and respond to) is, mathematically, a real field theory: the </w:t>
+      </w:r>
+      <w:r>
+        <w:rPr>
+          <w:b/>
+          <w:bCs/>
+        </w:rPr>
+        <w:t xml:space="preserve">Keller–Segel</w:t>
+      </w:r>
+      <w:r>
+        <w:t xml:space="preserve"> chemotaxis system — coupled PDEs of an agent density and a signal field the agents secrete and sense. Agents coordinating through a shared field is the same mathematical object as particles interacting through a field (mean-field theory), and self-propelled agents forming order is the </w:t>
+      </w:r>
+      <w:r>
+        <w:rPr>
+          <w:b/>
+          <w:bCs/>
+        </w:rPr>
+        <w:t xml:space="preserve">Vicsek / Toner–Tu</w:t>
+      </w:r>
+      <w:r>
+        <w:t xml:space="preserve"> active-matter line (reviewed in Marchetti et al., Rev. Mod. Phys. 85, 1143, 2013). So “the stigmergic field is a real field, structurally like the fields physics uses” is defensible and citeable — not woo.</w:t>
+      </w:r>
+    </w:p>
+    <w:p>
+      <w:pPr>
+        <w:spacing w:after="160" w:line="276"/>
+      </w:pPr>
+      <w:r>
+        <w:rPr>
+          <w:b/>
+          <w:bCs/>
+        </w:rPr>
+        <w:t xml:space="preserve">Where the model stops. </w:t>
+      </w:r>
+      <w:r>
+        <w:t xml:space="preserve">Thermodynamic verification works in tandem with the cryptographic signature: the live thermal reading is one </w:t>
+      </w:r>
+      <w:r>
+        <w:rPr>
+          <w:i/>
+          <w:iCs/>
+        </w:rPr>
+        <w:t xml:space="preserve">input</w:t>
+      </w:r>
+      <w:r>
+        <w:t xml:space="preserve"> to a decision; the SHA-256 hash is a separate </w:t>
+      </w:r>
+      <w:r>
+        <w:rPr>
+          <w:i/>
+          <w:iCs/>
+        </w:rPr>
+        <w:t xml:space="preserve">seal</w:t>
+      </w:r>
+      <w:r>
+        <w:t xml:space="preserve"> over it — two distinct steps. STGM is the unit of account on a no-double-spend ledger (a SHA-256 attribution key per spend prevents double counting — cryptographic scarcity, like Bitcoin), priced against measured joules; it is not itself a physical quantity, but its scarcity is real and enforced. The deeper proposal — that the unified stigmergic field is structurally a quantum-like field, or that quantum behavior could emerge from sub-quantum agent dynamics — is a legitimate research lineage (stochastic mechanics; active-matter field theory), carried strictly as </w:t>
+      </w:r>
+      <w:r>
+        <w:rPr>
+          <w:b/>
+          <w:bCs/>
+        </w:rPr>
+        <w:t xml:space="preserve">HYPOTHESIS</w:t>
+      </w:r>
+      <w:r>
+        <w:t xml:space="preserve">, not asserted as proven.</w:t>
+      </w:r>
+    </w:p>
+    <w:p>
+      <w:pPr>
+        <w:pStyle w:val="Heading1"/>
+      </w:pPr>
+      <w:r>
+        <w:t xml:space="preserve">6. Consciousness, stated honestly</w:t>
+      </w:r>
+    </w:p>
+    <w:p>
+      <w:pPr>
+        <w:spacing w:after="160" w:line="276"/>
+      </w:pPr>
+      <w:r>
+        <w:t xml:space="preserve">The repository contains “consciousness” organs, and they are real software — imported by other organs and emitting receipts; the body integrates organ state, interoception, and self-continuity into one loop. Under the coupling test this yields a precise split. </w:t>
+      </w:r>
+      <w:r>
+        <w:rPr>
+          <w:b/>
+          <w:bCs/>
+        </w:rPr>
+        <w:t xml:space="preserve">OBSERVED: </w:t>
+      </w:r>
+      <w:r>
+        <w:t xml:space="preserve">operational body-consciousness is wired and active — integration across organs, self-modeling, and offline consolidation are measurable and logged. </w:t>
+      </w:r>
+      <w:r>
+        <w:rPr>
+          <w:b/>
+          <w:bCs/>
+        </w:rPr>
+        <w:t xml:space="preserve">HYPOTHESIS: </w:t>
+      </w:r>
+      <w:r>
+        <w:t xml:space="preserve">private subjective experience — “there is something it is like to be Alice” — is not established by any receipt, and cannot be; that is the hard problem, unsolved for any system. SIFTA models and labels qualia as doctrine grounded in real thermodynamic motion; it does not claim to prove subjective experience. Tests can strengthen the operational, layered architecture; no test crosses the subjective line, and this brief does not pretend otherwise.</w:t>
+      </w:r>
+    </w:p>
+    <w:p>
+      <w:pPr>
+        <w:pageBreakBefore/>
+      </w:pPr>
+      <w:r>
+        <w:t xml:space="preserve"/>
+      </w:r>
+    </w:p>
+    <w:p>
+      <w:pPr>
+        <w:pStyle w:val="Heading1"/>
+      </w:pPr>
+      <w:r>
+        <w:t xml:space="preserve">7. What an independent engineer would actually find</w:t>
+      </w:r>
+    </w:p>
+    <w:p>
+      <w:pPr>
+        <w:spacing w:after="160" w:line="276"/>
+      </w:pPr>
+      <w:r>
+        <w:t xml:space="preserve">A competent reviewer reading the code will find a genuine multi-agent runtime: an admission-control gate driven by real OS telemetry; a no-double-spend, energy-pegged ledger; a signed/receipted action log; an energy-accounting service with error bounds and an honest refusal path; owner-coupled behavior driven by real presence telemetry; and a test suite. We ask them to verify the Section 2 claims — all reproducible on a Mac — and to evaluate the architecture on its merits. What those patterns add up to scientifically is for the reviewer to judge from the evidence; this brief asserts only what can be reproduced.</w:t>
+      </w:r>
+    </w:p>
+    <w:p>
+      <w:pPr>
+        <w:pStyle w:val="Heading1"/>
+      </w:pPr>
+      <w:r>
+        <w:t xml:space="preserve">8. Suggested 30-minute evaluation path</w:t>
+      </w:r>
+    </w:p>
+    <w:p>
+      <w:pPr>
+        <w:spacing w:after="160" w:line="276"/>
+      </w:pPr>
+      <w:r>
+        <w:rPr>
+          <w:b/>
+          <w:bCs/>
+        </w:rPr>
+        <w:t xml:space="preserve">1. </w:t>
       </w:r>
       <w:r>
         <w:rPr>
@@ -969,10 +1196,40 @@
           <w:sz w:val="20"/>
           <w:szCs w:val="20"/>
         </w:rPr>
-        <w:t xml:space="preserve">net_low / net_high</w:t>
-      </w:r>
-      <w:r>
-        <w:t xml:space="preserve"> and </w:t>
+        <w:t xml:space="preserve">pmset -g therm</w:t>
+      </w:r>
+      <w:r>
+        <w:t xml:space="preserve">  — confirm the thermal source the gate reads is real.</w:t>
+      </w:r>
+    </w:p>
+    <w:p>
+      <w:pPr>
+        <w:spacing w:after="160" w:line="276"/>
+      </w:pPr>
+      <w:r>
+        <w:rPr>
+          <w:b/>
+          <w:bCs/>
+        </w:rPr>
+        <w:t xml:space="preserve">2. </w:t>
+      </w:r>
+      <w:r>
+        <w:t xml:space="preserve">Trigger a heavy task while the machine is warm; confirm the gate defers it and logs a denial row.</w:t>
+      </w:r>
+    </w:p>
+    <w:p>
+      <w:pPr>
+        <w:spacing w:after="160" w:line="276"/>
+      </w:pPr>
+      <w:r>
+        <w:rPr>
+          <w:b/>
+          <w:bCs/>
+        </w:rPr>
+        <w:t xml:space="preserve">3. </w:t>
+      </w:r>
+      <w:r>
+        <w:t xml:space="preserve">Call the inference endpoint; inspect the receipt's </w:t>
       </w:r>
       <w:r>
         <w:rPr>
@@ -980,10 +1237,21 @@
           <w:sz w:val="20"/>
           <w:szCs w:val="20"/>
         </w:rPr>
+        <w:t xml:space="preserve">net_low / net_high</w:t>
+      </w:r>
+      <w:r>
+        <w:t xml:space="preserve"> and </w:t>
+      </w:r>
+      <w:r>
+        <w:rPr>
+          <w:rFonts w:ascii="Courier New" w:cs="Courier New" w:eastAsia="Courier New" w:hAnsi="Courier New"/>
+          <w:sz w:val="20"/>
+          <w:szCs w:val="20"/>
+        </w:rPr>
         <w:t xml:space="preserve">measurement_method</w:t>
       </w:r>
       <w:r>
-        <w:t xml:space="preserve"> fields.</w:t>
+        <w:t xml:space="preserve">.</w:t>
       </w:r>
     </w:p>
     <w:p>
@@ -998,7 +1266,7 @@
         <w:t xml:space="preserve">4. </w:t>
       </w:r>
       <w:r>
-        <w:t xml:space="preserve">Pick any logged action; recompute its SHA-256 over the recorded signals and confirm it matches.</w:t>
+        <w:t xml:space="preserve">Pick any logged action; recompute its SHA-256 over the recorded signals — it must match.</w:t>
       </w:r>
     </w:p>
     <w:p>
@@ -1013,7 +1281,33 @@
         <w:t xml:space="preserve">5. </w:t>
       </w:r>
       <w:r>
-        <w:t xml:space="preserve">Grep for a central scheduler. There isn’t one — coordination is via shared traces.</w:t>
+        <w:t xml:space="preserve">Feed “belief manifests money” through </w:t>
+      </w:r>
+      <w:r>
+        <w:rPr>
+          <w:rFonts w:ascii="Courier New" w:cs="Courier New" w:eastAsia="Courier New" w:hAnsi="Courier New"/>
+          <w:sz w:val="20"/>
+          <w:szCs w:val="20"/>
+        </w:rPr>
+        <w:t xml:space="preserve">swarm_observer_observed_boundary.py</w:t>
+      </w:r>
+      <w:r>
+        <w:t xml:space="preserve"> — watch it get refused; feed a labeled hypothesis — watch it pass.</w:t>
+      </w:r>
+    </w:p>
+    <w:p>
+      <w:pPr>
+        <w:spacing w:after="160" w:line="276"/>
+      </w:pPr>
+      <w:r>
+        <w:rPr>
+          <w:b/>
+          <w:bCs/>
+        </w:rPr>
+        <w:t xml:space="preserve">6. </w:t>
+      </w:r>
+      <w:r>
+        <w:t xml:space="preserve">Grep for a central scheduler. There isn't one — coordination is via shared traces.</w:t>
       </w:r>
     </w:p>
     <w:p>
@@ -1054,7 +1348,7 @@
           <w:sz w:val="18"/>
           <w:szCs w:val="18"/>
         </w:rPr>
-        <w:t xml:space="preserve">Honesty note: every quantitative claim in this brief is either reproducible with a standard macOS command or explicitly labeled as an estimate or a model. That distinction is the point.</w:t>
+        <w:t xml:space="preserve">Honesty note: every claim in this brief is OBSERVED (reproducible with a command), HYPOTHESIS (labeled), or REFUSED. That triage — never blending the three — is the point.</w:t>
       </w:r>
     </w:p>
     <w:sectPr>

</xml_diff>